<commit_message>
docs: sesuaikan penyusun atas nama Zikry Kurniawan dan samakan format sampul (cover page) dengan template asli IEEE SRS
</commit_message>
<xml_diff>
--- a/skpl/IEEE_SRS_Mind_Passport.docx
+++ b/skpl/IEEE_SRS_Mind_Passport.docx
@@ -4,7 +4,7 @@
   <w:body>
     <w:p>
       <w:pPr>
-        <w:spacing w:before="720" w:after="120"/>
+        <w:spacing w:before="720" w:after="240"/>
         <w:jc w:val="center"/>
       </w:pPr>
       <w:r>
@@ -12,11 +12,24 @@
           <w:rFonts w:ascii="Arial" w:hAnsi="Arial"/>
           <w:b/>
           <w:color w:val="1E1B4B"/>
-          <w:sz w:val="40"/>
+          <w:sz w:val="48"/>
         </w:rPr>
-        <w:t>SPESIFIKASI KEBUTUHAN PERANGKAT LUNAK</w:t>
-        <w:br/>
-        <w:t>(SOFTWARE REQUIREMENTS SPECIFICATION)</w:t>
+        <w:t>Software Requirements Specification</w:t>
+      </w:r>
+    </w:p>
+    <w:p>
+      <w:pPr>
+        <w:spacing w:after="240"/>
+        <w:jc w:val="center"/>
+      </w:pPr>
+      <w:r>
+        <w:rPr>
+          <w:rFonts w:ascii="Arial" w:hAnsi="Arial"/>
+          <w:i/>
+          <w:color w:val="64748B"/>
+          <w:sz w:val="28"/>
+        </w:rPr>
+        <w:t>for</w:t>
       </w:r>
     </w:p>
     <w:p>
@@ -27,92 +40,69 @@
       <w:r>
         <w:rPr>
           <w:rFonts w:ascii="Arial" w:hAnsi="Arial"/>
+          <w:b/>
           <w:color w:val="4F46E5"/>
-          <w:sz w:val="28"/>
+          <w:sz w:val="36"/>
         </w:rPr>
-        <w:t>MIND PASSPORT: Ekosistem Digital Paspor Kompetensi &amp;</w:t>
-        <w:br/>
-        <w:t>Kesiapan Karier Otonom Berbasis AI</w:t>
+        <w:t>Mind Passport (Sistem Paspor Kompetensi &amp; Kesiapan Kerja Otonom)</w:t>
       </w:r>
     </w:p>
     <w:p>
       <w:pPr>
-        <w:spacing w:before="160" w:after="40"/>
+        <w:spacing w:after="960"/>
         <w:jc w:val="center"/>
       </w:pPr>
       <w:r>
-        <w:drawing>
-          <wp:inline xmlns:a="http://schemas.openxmlformats.org/drawingml/2006/main" xmlns:pic="http://schemas.openxmlformats.org/drawingml/2006/picture">
-            <wp:extent cx="5303520" cy="3160684"/>
-            <wp:docPr id="1" name="Picture 1"/>
-            <wp:cNvGraphicFramePr>
-              <a:graphicFrameLocks noChangeAspect="1"/>
-            </wp:cNvGraphicFramePr>
-            <a:graphic>
-              <a:graphicData uri="http://schemas.openxmlformats.org/drawingml/2006/picture">
-                <pic:pic>
-                  <pic:nvPicPr>
-                    <pic:cNvPr id="0" name="architecture_diagram.png"/>
-                    <pic:cNvPicPr/>
-                  </pic:nvPicPr>
-                  <pic:blipFill>
-                    <a:blip r:embed="rId9"/>
-                    <a:stretch>
-                      <a:fillRect/>
-                    </a:stretch>
-                  </pic:blipFill>
-                  <pic:spPr>
-                    <a:xfrm>
-                      <a:off x="0" y="0"/>
-                      <a:ext cx="5303520" cy="3160684"/>
-                    </a:xfrm>
-                    <a:prstGeom prst="rect"/>
-                  </pic:spPr>
-                </pic:pic>
-              </a:graphicData>
-            </a:graphic>
-          </wp:inline>
-        </w:drawing>
+        <w:rPr>
+          <w:rFonts w:ascii="Arial" w:hAnsi="Arial"/>
+          <w:b/>
+          <w:color w:val="0EA5E9"/>
+          <w:sz w:val="24"/>
+        </w:rPr>
+        <w:t>Version 1.0 approved</w:t>
       </w:r>
     </w:p>
     <w:p>
       <w:pPr>
-        <w:spacing w:before="40" w:after="200"/>
+        <w:spacing w:after="120"/>
         <w:jc w:val="center"/>
       </w:pPr>
       <w:r>
         <w:rPr>
-          <w:rFonts w:ascii="Calibri" w:hAnsi="Calibri"/>
-          <w:i/>
-          <w:color w:val="64748B"/>
-          <w:sz w:val="19"/>
+          <w:rFonts w:ascii="Arial" w:hAnsi="Arial"/>
+          <w:color w:val="475569"/>
+          <w:sz w:val="24"/>
         </w:rPr>
-        <w:t>Gambar 0.1 Arsitektur Sistem Utama Mind Passport</w:t>
+        <w:t xml:space="preserve">Prepared by </w:t>
       </w:r>
     </w:p>
     <w:p>
       <w:pPr>
-        <w:spacing w:before="480" w:after="480"/>
+        <w:spacing w:after="1440"/>
         <w:jc w:val="center"/>
       </w:pPr>
       <w:r>
         <w:rPr>
-          <w:rFonts w:ascii="Calibri" w:hAnsi="Calibri"/>
-          <w:color w:val="475569"/>
+          <w:rFonts w:ascii="Arial" w:hAnsi="Arial"/>
+          <w:b/>
+          <w:color w:val="1E1B4B"/>
+          <w:sz w:val="28"/>
+        </w:rPr>
+        <w:t>Zikry Kurniawan</w:t>
+      </w:r>
+    </w:p>
+    <w:p>
+      <w:pPr>
+        <w:spacing w:after="480"/>
+        <w:jc w:val="center"/>
+      </w:pPr>
+      <w:r>
+        <w:rPr>
+          <w:rFonts w:ascii="Arial" w:hAnsi="Arial"/>
+          <w:color w:val="64748B"/>
           <w:sz w:val="22"/>
         </w:rPr>
-        <w:t>Standar Dokumen: IEEE Std 830-1998</w:t>
-        <w:br/>
-        <w:t>Versi Dokumen: 1.0 (Final Approved)</w:t>
-        <w:br/>
-        <w:t>Tanggal Penyusunan: 22 Juli 2026</w:t>
-        <w:br/>
-        <w:br/>
-        <w:t>Disusun Oleh:</w:t>
-        <w:br/>
-        <w:t>Tim Pengembang Mind Passport</w:t>
-        <w:br/>
-        <w:t>Program Studi Teknik Informatika / Sistem Informasi</w:t>
+        <w:t>22 Juli 2026</w:t>
       </w:r>
     </w:p>
     <w:p>
@@ -132,7 +122,7 @@
           <w:color w:val="1E1B4B"/>
           <w:sz w:val="32"/>
         </w:rPr>
-        <w:t>Riwayat Revisi Dokumen (Revision History)</w:t>
+        <w:t>Revision History</w:t>
       </w:r>
     </w:p>
     <w:tbl>
@@ -164,7 +154,7 @@
                 <w:color w:val="FFFFFF"/>
                 <w:sz w:val="20"/>
               </w:rPr>
-              <w:t>Pengubah / Tim</w:t>
+              <w:t>Name</w:t>
             </w:r>
           </w:p>
         </w:tc>
@@ -184,7 +174,7 @@
                 <w:color w:val="FFFFFF"/>
                 <w:sz w:val="20"/>
               </w:rPr>
-              <w:t>Tanggal</w:t>
+              <w:t>Date</w:t>
             </w:r>
           </w:p>
         </w:tc>
@@ -204,7 +194,7 @@
                 <w:color w:val="FFFFFF"/>
                 <w:sz w:val="20"/>
               </w:rPr>
-              <w:t>Alasan Perubahan</w:t>
+              <w:t>Reason For Changes</w:t>
             </w:r>
           </w:p>
         </w:tc>
@@ -224,7 +214,7 @@
                 <w:color w:val="FFFFFF"/>
                 <w:sz w:val="20"/>
               </w:rPr>
-              <w:t>Versi</w:t>
+              <w:t>Version</w:t>
             </w:r>
           </w:p>
         </w:tc>
@@ -242,7 +232,7 @@
                 <w:color w:val="1E293B"/>
                 <w:sz w:val="19"/>
               </w:rPr>
-              <w:t>Tim Pengembang Mind Passport</w:t>
+              <w:t>Zikry Kurniawan</w:t>
             </w:r>
           </w:p>
         </w:tc>
@@ -342,7 +332,7 @@
           <w:color w:val="334155"/>
           <w:sz w:val="22"/>
         </w:rPr>
-        <w:t>Dokumen Spesifikasi Kebutuhan Perangkat Lunak (SKPL) ini disusun secara komprehensif untuk mendefinisikan seluruh Kebutuhan Fungsional (Functional Requirements) dan Kebutuhan Non-Fungsional (Non-Functional Requirements) dari perangkat lunak Mind Passport. Dokumen ini dibuat berdasarkan standar internasional IEEE Std 830-1998 dan bertindak sebagai kontrak teknis resmi antara tim pengembang (developers), perancang sistem (system designers), penguji (quality assurance), dan institusi / penguji akademis untuk memverifikasi kelayakan dan kualitas perangkat lunak.</w:t>
+        <w:t>Dokumen Spesifikasi Kebutuhan Perangkat Lunak (SKPL) ini disusun secara komprehensif untuk mendefinisikan secara formal seluruh Kebutuhan Fungsional (Functional Requirements) dan Kebutuhan Non-Fungsional (Non-Functional Requirements) dari perangkat lunak Mind Passport. Dokumen ini dibuat berdasarkan standar internasional IEEE Std 830-1998 dan bertindak sebagai kontrak teknis resmi antara tim pengembang (developers), perancang sistem (system designers), penguji (quality assurance), dan institusi / penguji akademis untuk memverifikasi kelayakan dan kualitas perangkat lunak.</w:t>
       </w:r>
     </w:p>
     <w:p>
@@ -899,6 +889,61 @@
           <w:sz w:val="22"/>
         </w:rPr>
         <w:t>Mind Passport dirancang sebagai solusi atas permasalahan kesenjangan keahlian (skill gap) yang sering dialami oleh lulusan baru perguruan tinggi. Aplikasi web ini mengintegrasikan seluruh alur pengembangan diri secara otonom: dimulai dari pengisian kuesioner potensi (Career DNA), analisis kekurangan skill terhadap target industri (Skill Gap), penyusunan kurikulum belajar mandiri bertahap (Roadmap), pelacakan portofolio bukti fisik (Progress Tracker), kalkulasi skor kesiapan kerja terpadu (Readiness Score), bimbingan konsultasi AI (Navigator), hingga penerbitan Paspor Kompetensi Digital yang terverifikasi dan siap di-scan oleh pihak rekruter industri.</w:t>
+      </w:r>
+    </w:p>
+    <w:p>
+      <w:pPr>
+        <w:spacing w:before="160" w:after="40"/>
+        <w:jc w:val="center"/>
+      </w:pPr>
+      <w:r>
+        <w:drawing>
+          <wp:inline xmlns:a="http://schemas.openxmlformats.org/drawingml/2006/main" xmlns:pic="http://schemas.openxmlformats.org/drawingml/2006/picture">
+            <wp:extent cx="5303520" cy="3160684"/>
+            <wp:docPr id="1" name="Picture 1"/>
+            <wp:cNvGraphicFramePr>
+              <a:graphicFrameLocks noChangeAspect="1"/>
+            </wp:cNvGraphicFramePr>
+            <a:graphic>
+              <a:graphicData uri="http://schemas.openxmlformats.org/drawingml/2006/picture">
+                <pic:pic>
+                  <pic:nvPicPr>
+                    <pic:cNvPr id="0" name="architecture_diagram.png"/>
+                    <pic:cNvPicPr/>
+                  </pic:nvPicPr>
+                  <pic:blipFill>
+                    <a:blip r:embed="rId9"/>
+                    <a:stretch>
+                      <a:fillRect/>
+                    </a:stretch>
+                  </pic:blipFill>
+                  <pic:spPr>
+                    <a:xfrm>
+                      <a:off x="0" y="0"/>
+                      <a:ext cx="5303520" cy="3160684"/>
+                    </a:xfrm>
+                    <a:prstGeom prst="rect"/>
+                  </pic:spPr>
+                </pic:pic>
+              </a:graphicData>
+            </a:graphic>
+          </wp:inline>
+        </w:drawing>
+      </w:r>
+    </w:p>
+    <w:p>
+      <w:pPr>
+        <w:spacing w:before="40" w:after="200"/>
+        <w:jc w:val="center"/>
+      </w:pPr>
+      <w:r>
+        <w:rPr>
+          <w:rFonts w:ascii="Calibri" w:hAnsi="Calibri"/>
+          <w:i/>
+          <w:color w:val="64748B"/>
+          <w:sz w:val="19"/>
+        </w:rPr>
+        <w:t>Gambar 2.1 Diagram Arsitektur Sistem Utama Mind Passport</w:t>
       </w:r>
     </w:p>
     <w:p>
@@ -1939,7 +1984,7 @@
           <w:color w:val="4F46E5"/>
           <w:sz w:val="26"/>
         </w:rPr>
-        <w:t>3.4 Communication Interfaces (Antarmuka Komunikasi)</w:t>
+        <w:t>3.4 Communication Interfaces (Antarmuka Komunikasi &amp; Kamus Data API)</w:t>
       </w:r>
     </w:p>
     <w:p>
@@ -3348,7 +3393,7 @@
                 <w:color w:val="1E293B"/>
                 <w:sz w:val="19"/>
               </w:rPr>
-              <w:t>Admin dapat memantau riwayat log login dan statistik aktivitas pengusung sesi.</w:t>
+              <w:t>Admin dapat memantau riwayat log masuk sistem dan statistik aktivitas pengusung sesi.</w:t>
             </w:r>
           </w:p>
         </w:tc>
@@ -4876,7 +4921,7 @@
         <w:br/>
         <w:t>_____________________________________</w:t>
         <w:br/>
-        <w:t>Tim Pengembang Mind Passport</w:t>
+        <w:t>Zikry Kurniawan</w:t>
         <w:br/>
         <w:t>Tanggal Pengesahan: 22 Juli 2026</w:t>
       </w:r>

</xml_diff>

<commit_message>
fix: perbaiki diagram gambar (padding luas & ukuran 5.2 inch) agar tidak terpotong pada dokumen Word dan PDF
</commit_message>
<xml_diff>
--- a/skpl/IEEE_SRS_Mind_Passport.docx
+++ b/skpl/IEEE_SRS_Mind_Passport.docx
@@ -2605,7 +2605,7 @@
       <w:r>
         <w:drawing>
           <wp:inline xmlns:a="http://schemas.openxmlformats.org/drawingml/2006/main" xmlns:pic="http://schemas.openxmlformats.org/drawingml/2006/picture">
-            <wp:extent cx="5029200" cy="2997200"/>
+            <wp:extent cx="4754880" cy="3121856"/>
             <wp:docPr id="1" name="Picture 1"/>
             <wp:cNvGraphicFramePr>
               <a:graphicFrameLocks noChangeAspect="1"/>
@@ -2626,7 +2626,7 @@
                   <pic:spPr>
                     <a:xfrm>
                       <a:off x="0" y="0"/>
-                      <a:ext cx="5029200" cy="2997200"/>
+                      <a:ext cx="4754880" cy="3121856"/>
                     </a:xfrm>
                     <a:prstGeom prst="rect"/>
                   </pic:spPr>
@@ -4458,7 +4458,7 @@
       <w:r>
         <w:drawing>
           <wp:inline xmlns:a="http://schemas.openxmlformats.org/drawingml/2006/main" xmlns:pic="http://schemas.openxmlformats.org/drawingml/2006/picture">
-            <wp:extent cx="5029200" cy="3505200"/>
+            <wp:extent cx="4754880" cy="3722948"/>
             <wp:docPr id="2" name="Picture 2"/>
             <wp:cNvGraphicFramePr>
               <a:graphicFrameLocks noChangeAspect="1"/>
@@ -4479,7 +4479,7 @@
                   <pic:spPr>
                     <a:xfrm>
                       <a:off x="0" y="0"/>
-                      <a:ext cx="5029200" cy="3505200"/>
+                      <a:ext cx="4754880" cy="3722948"/>
                     </a:xfrm>
                     <a:prstGeom prst="rect"/>
                   </pic:spPr>
@@ -4830,7 +4830,7 @@
       <w:r>
         <w:drawing>
           <wp:inline xmlns:a="http://schemas.openxmlformats.org/drawingml/2006/main" xmlns:pic="http://schemas.openxmlformats.org/drawingml/2006/picture">
-            <wp:extent cx="5029200" cy="3020592"/>
+            <wp:extent cx="4754880" cy="3121856"/>
             <wp:docPr id="3" name="Picture 3"/>
             <wp:cNvGraphicFramePr>
               <a:graphicFrameLocks noChangeAspect="1"/>
@@ -4851,7 +4851,7 @@
                   <pic:spPr>
                     <a:xfrm>
                       <a:off x="0" y="0"/>
-                      <a:ext cx="5029200" cy="3020592"/>
+                      <a:ext cx="4754880" cy="3121856"/>
                     </a:xfrm>
                     <a:prstGeom prst="rect"/>
                   </pic:spPr>
@@ -4946,7 +4946,7 @@
       <w:r>
         <w:drawing>
           <wp:inline xmlns:a="http://schemas.openxmlformats.org/drawingml/2006/main" xmlns:pic="http://schemas.openxmlformats.org/drawingml/2006/picture">
-            <wp:extent cx="5029200" cy="3505200"/>
+            <wp:extent cx="4754880" cy="3722948"/>
             <wp:docPr id="4" name="Picture 4"/>
             <wp:cNvGraphicFramePr>
               <a:graphicFrameLocks noChangeAspect="1"/>
@@ -4967,7 +4967,7 @@
                   <pic:spPr>
                     <a:xfrm>
                       <a:off x="0" y="0"/>
-                      <a:ext cx="5029200" cy="3505200"/>
+                      <a:ext cx="4754880" cy="3722948"/>
                     </a:xfrm>
                     <a:prstGeom prst="rect"/>
                   </pic:spPr>

</xml_diff>

<commit_message>
fix: terapkan pemisah halaman (page break) khusus untuk setiap diagram sehingga gambar 100% utuh di halaman baru tanpa tertutup margin
</commit_message>
<xml_diff>
--- a/skpl/IEEE_SRS_Mind_Passport.docx
+++ b/skpl/IEEE_SRS_Mind_Passport.docx
@@ -2599,13 +2599,14 @@
     </w:p>
     <w:p>
       <w:pPr>
-        <w:spacing w:before="160" w:after="40"/>
+        <w:pageBreakBefore/>
+        <w:spacing w:before="240" w:after="80"/>
         <w:jc w:val="center"/>
       </w:pPr>
       <w:r>
         <w:drawing>
           <wp:inline xmlns:a="http://schemas.openxmlformats.org/drawingml/2006/main" xmlns:pic="http://schemas.openxmlformats.org/drawingml/2006/picture">
-            <wp:extent cx="4754880" cy="3121856"/>
+            <wp:extent cx="5120640" cy="3361999"/>
             <wp:docPr id="1" name="Picture 1"/>
             <wp:cNvGraphicFramePr>
               <a:graphicFrameLocks noChangeAspect="1"/>
@@ -2626,7 +2627,7 @@
                   <pic:spPr>
                     <a:xfrm>
                       <a:off x="0" y="0"/>
-                      <a:ext cx="4754880" cy="3121856"/>
+                      <a:ext cx="5120640" cy="3361999"/>
                     </a:xfrm>
                     <a:prstGeom prst="rect"/>
                   </pic:spPr>
@@ -2639,7 +2640,7 @@
     </w:p>
     <w:p>
       <w:pPr>
-        <w:spacing w:after="200"/>
+        <w:spacing w:before="40" w:after="240"/>
         <w:jc w:val="center"/>
       </w:pPr>
       <w:r>
@@ -4452,13 +4453,14 @@
     </w:p>
     <w:p>
       <w:pPr>
-        <w:spacing w:before="160" w:after="40"/>
+        <w:pageBreakBefore/>
+        <w:spacing w:before="240" w:after="80"/>
         <w:jc w:val="center"/>
       </w:pPr>
       <w:r>
         <w:drawing>
           <wp:inline xmlns:a="http://schemas.openxmlformats.org/drawingml/2006/main" xmlns:pic="http://schemas.openxmlformats.org/drawingml/2006/picture">
-            <wp:extent cx="4754880" cy="3722948"/>
+            <wp:extent cx="5120640" cy="4009328"/>
             <wp:docPr id="2" name="Picture 2"/>
             <wp:cNvGraphicFramePr>
               <a:graphicFrameLocks noChangeAspect="1"/>
@@ -4479,7 +4481,7 @@
                   <pic:spPr>
                     <a:xfrm>
                       <a:off x="0" y="0"/>
-                      <a:ext cx="4754880" cy="3722948"/>
+                      <a:ext cx="5120640" cy="4009328"/>
                     </a:xfrm>
                     <a:prstGeom prst="rect"/>
                   </pic:spPr>
@@ -4492,7 +4494,7 @@
     </w:p>
     <w:p>
       <w:pPr>
-        <w:spacing w:after="200"/>
+        <w:spacing w:before="40" w:after="240"/>
         <w:jc w:val="center"/>
       </w:pPr>
       <w:r>
@@ -4824,13 +4826,14 @@
     </w:p>
     <w:p>
       <w:pPr>
-        <w:spacing w:before="160" w:after="40"/>
+        <w:pageBreakBefore/>
+        <w:spacing w:before="240" w:after="80"/>
         <w:jc w:val="center"/>
       </w:pPr>
       <w:r>
         <w:drawing>
           <wp:inline xmlns:a="http://schemas.openxmlformats.org/drawingml/2006/main" xmlns:pic="http://schemas.openxmlformats.org/drawingml/2006/picture">
-            <wp:extent cx="4754880" cy="3121856"/>
+            <wp:extent cx="5120640" cy="3361999"/>
             <wp:docPr id="3" name="Picture 3"/>
             <wp:cNvGraphicFramePr>
               <a:graphicFrameLocks noChangeAspect="1"/>
@@ -4851,7 +4854,7 @@
                   <pic:spPr>
                     <a:xfrm>
                       <a:off x="0" y="0"/>
-                      <a:ext cx="4754880" cy="3121856"/>
+                      <a:ext cx="5120640" cy="3361999"/>
                     </a:xfrm>
                     <a:prstGeom prst="rect"/>
                   </pic:spPr>
@@ -4864,7 +4867,7 @@
     </w:p>
     <w:p>
       <w:pPr>
-        <w:spacing w:after="200"/>
+        <w:spacing w:before="40" w:after="240"/>
         <w:jc w:val="center"/>
       </w:pPr>
       <w:r>
@@ -4940,13 +4943,14 @@
     </w:p>
     <w:p>
       <w:pPr>
-        <w:spacing w:before="160" w:after="40"/>
+        <w:pageBreakBefore/>
+        <w:spacing w:before="240" w:after="80"/>
         <w:jc w:val="center"/>
       </w:pPr>
       <w:r>
         <w:drawing>
           <wp:inline xmlns:a="http://schemas.openxmlformats.org/drawingml/2006/main" xmlns:pic="http://schemas.openxmlformats.org/drawingml/2006/picture">
-            <wp:extent cx="4754880" cy="3722948"/>
+            <wp:extent cx="5120640" cy="4009328"/>
             <wp:docPr id="4" name="Picture 4"/>
             <wp:cNvGraphicFramePr>
               <a:graphicFrameLocks noChangeAspect="1"/>
@@ -4967,7 +4971,7 @@
                   <pic:spPr>
                     <a:xfrm>
                       <a:off x="0" y="0"/>
-                      <a:ext cx="4754880" cy="3722948"/>
+                      <a:ext cx="5120640" cy="4009328"/>
                     </a:xfrm>
                     <a:prstGeom prst="rect"/>
                   </pic:spPr>
@@ -4980,7 +4984,7 @@
     </w:p>
     <w:p>
       <w:pPr>
-        <w:spacing w:after="200"/>
+        <w:spacing w:before="40" w:after="240"/>
         <w:jc w:val="center"/>
       </w:pPr>
       <w:r>

</xml_diff>